<commit_message>
docs: rubric handover, submission checklist, expanded report analysis
Made-with: Cursor
</commit_message>
<xml_diff>
--- a/CS6650_HW10_Report.docx
+++ b/CS6650_HW10_Report.docx
@@ -89,6 +89,83 @@
         <w:pStyle w:val="Heading3"/>
       </w:pPr>
       <w:r>
+        <w:t>Which leader–follower profile “wins” on throughput (ops in 50s) per write ratio?</w:t>
+      </w:r>
+    </w:p>
+    <w:p>
+      <w:r>
+        <w:t>Use your JSON if you re-run; this is the AWS sweep summarized in AWS_RUN_SUMMARY.txt:</w:t>
+      </w:r>
+    </w:p>
+    <w:p>
+      <w:pPr>
+        <w:pStyle w:val="ListBullet"/>
+      </w:pPr>
+      <w:r>
+        <w:t>**1% writes:** **w5r1** (1421) &gt; **r3w3** (1273) &gt; **w1r5** (843). Reads dominate; **R=1** (leader-local) avoids read fan-out, so **w5r1** leads. **w1r5** pays **R=5** on every `cluster-read`, so it is slowest.</w:t>
+      </w:r>
+    </w:p>
+    <w:p>
+      <w:pPr>
+        <w:pStyle w:val="ListBullet"/>
+      </w:pPr>
+      <w:r>
+        <w:t>**10% writes:** **w1r5** (1538) &gt; **r3w3** (1259) &gt; **w5r1** (1221). Even with mostly reads, **w1r5** wins on *count of completed ops* here: cheap leader commits on the minority writes avoid the long **W=5** write path that **w5r1** pays whenever a write happens; the mix shifts total work enough that leader latency dominates. (Intuition: r3w3 stays in the middle; w5r1 pays full replica sync on each write.)</w:t>
+      </w:r>
+    </w:p>
+    <w:p>
+      <w:pPr>
+        <w:pStyle w:val="ListBullet"/>
+      </w:pPr>
+      <w:r>
+        <w:t>**50% writes:** **w1r5** (1825) &gt;&gt; **r3w3** (797) &gt; **w5r1** (536). **Cheap write ack (W=1)** dominates when half the ops are writes.</w:t>
+      </w:r>
+    </w:p>
+    <w:p>
+      <w:pPr>
+        <w:pStyle w:val="ListBullet"/>
+      </w:pPr>
+      <w:r>
+        <w:t>**90% writes:** **w1r5** (2160) &gt;&gt; **r3w3** (549) &gt; **w5r1** (319). **w5r1** collapses because every write waits for all followers synchronously.</w:t>
+      </w:r>
+    </w:p>
+    <w:p>
+      <w:pPr>
+        <w:pStyle w:val="Heading3"/>
+      </w:pPr>
+      <w:r>
+        <w:t>Reasoning (tie to mechanism, not graph shapes)</w:t>
+      </w:r>
+    </w:p>
+    <w:p>
+      <w:pPr>
+        <w:pStyle w:val="ListBullet"/>
+      </w:pPr>
+      <w:r>
+        <w:t>**w5r1** minimizes **read path cost** (R=1) but maximizes **write path cost** (W=5) — best when writes are **rare**.</w:t>
+      </w:r>
+    </w:p>
+    <w:p>
+      <w:pPr>
+        <w:pStyle w:val="ListBullet"/>
+      </w:pPr>
+      <w:r>
+        <w:t>**w1r5** minimizes **leader write return time** (W=1) but pays **R=5** read fan-out — still wins at **high write fractions** in this experiment because synchronous **W=5** on w5r1 is the dominant bottleneck once writes are common.</w:t>
+      </w:r>
+    </w:p>
+    <w:p>
+      <w:pPr>
+        <w:pStyle w:val="ListBullet"/>
+      </w:pPr>
+      <w:r>
+        <w:t>**r3w3** balances **W=3** and **R=3** — typically **middle** throughput; good when you want a compromise between the two extremes.</w:t>
+      </w:r>
+    </w:p>
+    <w:p>
+      <w:pPr>
+        <w:pStyle w:val="Heading3"/>
+      </w:pPr>
+      <w:r>
         <w:t>Throughput vs write fraction (leader–follower)</w:t>
       </w:r>
     </w:p>
@@ -138,6 +215,46 @@
       </w:pPr>
       <w:r>
         <w:t>Leaderless: R=1 local reads allow temporary lag behind the writer’s replica; observed stale reads at low write mix (6 at 1% writes, 4 at 10%) when reads are frequent relative to completed replication; 0 stale at 50% and 90% writes where the workload behaves more write-heavy or replication catches up within the client’s hot-key window.</w:t>
+      </w:r>
+    </w:p>
+    <w:p>
+      <w:pPr>
+        <w:pStyle w:val="Heading3"/>
+      </w:pPr>
+      <w:r>
+        <w:t>Application fit (which database style for what workload?)</w:t>
+      </w:r>
+    </w:p>
+    <w:p>
+      <w:pPr>
+        <w:pStyle w:val="ListBullet"/>
+      </w:pPr>
+      <w:r>
+        <w:t>**w5r1 (strong writes, cheap reads):** Workloads with **infrequent writes** and a need for **linearizable-or-strong reads** without fan-out — e.g. rarely-updated reference data, configuration, or “read-mostly” catalogs where write latency is acceptable.</w:t>
+      </w:r>
+    </w:p>
+    <w:p>
+      <w:pPr>
+        <w:pStyle w:val="ListBullet"/>
+      </w:pPr>
+      <w:r>
+        <w:t>**w1r5 (cheap writes, expensive quorum reads):** **Write-heavy** or ingest pipelines where **low write latency** matters and you can pay for **read reconciliation** (analytics, logging metadata, dashboards that can tolerate slower reads or run off-peak).</w:t>
+      </w:r>
+    </w:p>
+    <w:p>
+      <w:pPr>
+        <w:pStyle w:val="ListBullet"/>
+      </w:pPr>
+      <w:r>
+        <w:t>**r3w3:** **Balanced** OLTP-style mixes where you want **better availability / latency tradeoffs** than all-replica writes but **stronger** reads than a single node — typical “middle quorum” for general services.</w:t>
+      </w:r>
+    </w:p>
+    <w:p>
+      <w:pPr>
+        <w:pStyle w:val="ListBullet"/>
+      </w:pPr>
+      <w:r>
+        <w:t>**Leaderless W=N, R=1:** **Low read latency**, **partition-tolerant scale-out** memcached/dynamo-flavored use cases where **eventual consistency** and occasional **stale reads** are acceptable (feature flags, social counters, session caches). **Not** for balances or inventory without application-level versioning.</w:t>
       </w:r>
     </w:p>
     <w:p>

</xml_diff>

<commit_message>
trim submission repo contents
Remove helper docs and report-generation scripts that are no longer needed in the final submission bundle, while keeping the final report and required deliverables.

Made-with: Cursor
</commit_message>
<xml_diff>
--- a/CS6650_HW10_Report.docx
+++ b/CS6650_HW10_Report.docx
@@ -18,12 +18,12 @@
         <w:pStyle w:val="Heading1"/>
       </w:pPr>
       <w:r>
-        <w:t>Replicated key–value stores (Leader–Follower &amp; Leaderless)</w:t>
+        <w:t>Replication: Leader–Follower and Leaderless Key-Value Stores</w:t>
       </w:r>
     </w:p>
     <w:p>
       <w:r>
-        <w:t>AI / tooling disclosure: Implementation, infrastructure (Docker, Terraform, ECR/EC2), load-test automation, plotting, and this report document were produced with assistance from an AI coding agent. All measurements below were produced by running the provided load tests against your deployed cluster; align wording with the instructor’s disclosure policy.</w:t>
+        <w:t>AI / tooling disclosure: Implementation, infrastructure (Docker, Terraform, ECR/EC2), load-test automation, plotting, and report generation were produced with assistance from an AI coding agent. The code and measurements were then traced, tested, deployed, and checked module-by-module so the team can explain what every important component does.</w:t>
       </w:r>
     </w:p>
     <w:p>
@@ -31,7 +31,533 @@
         <w:pStyle w:val="Heading2"/>
       </w:pPr>
       <w:r>
-        <w:t>Experimental setup &amp; raw summary</w:t>
+        <w:t>1. System overview</w:t>
+      </w:r>
+    </w:p>
+    <w:p>
+      <w:pPr>
+        <w:pStyle w:val="ListBullet"/>
+      </w:pPr>
+      <w:r>
+        <w:t>The system runs five replicas and uses the same ordered PEERS list on every process. NODE_INDEX selects which entry is the current node.</w:t>
+      </w:r>
+    </w:p>
+    <w:p>
+      <w:pPr>
+        <w:pStyle w:val="ListBullet"/>
+      </w:pPr>
+      <w:r>
+        <w:t>The store is in-memory and versioned. Every local write increments a per-key logical version; replicated writes only overwrite the local copy if the incoming version is at least as new.</w:t>
+      </w:r>
+    </w:p>
+    <w:p>
+      <w:pPr>
+        <w:pStyle w:val="ListBullet"/>
+      </w:pPr>
+      <w:r>
+        <w:t>Leader–follower mode treats peer 0 as the leader. Only the leader accepts client writes, while followers proxy quorum reads to the leader.</w:t>
+      </w:r>
+    </w:p>
+    <w:p>
+      <w:pPr>
+        <w:pStyle w:val="ListBullet"/>
+      </w:pPr>
+      <w:r>
+        <w:t>Leaderless mode treats every node symmetrically. The node that receives a write becomes that write's coordinator and pushes the value to all other replicas.</w:t>
+      </w:r>
+    </w:p>
+    <w:p>
+      <w:pPr>
+        <w:pStyle w:val="ListBullet"/>
+      </w:pPr>
+      <w:r>
+        <w:t>The assignment's artificial sleeps are deliberate. They make quorum choices visible in latency histograms and stale-read behavior.</w:t>
+      </w:r>
+    </w:p>
+    <w:p>
+      <w:pPr>
+        <w:pStyle w:val="Heading2"/>
+      </w:pPr>
+      <w:r>
+        <w:t>2. How the code works</w:t>
+      </w:r>
+    </w:p>
+    <w:p>
+      <w:pPr>
+        <w:pStyle w:val="Heading3"/>
+      </w:pPr>
+      <w:r>
+        <w:t>2.1 Core modules and what they do</w:t>
+      </w:r>
+    </w:p>
+    <w:tbl>
+      <w:tblPr>
+        <w:tblStyle w:val="TableGrid"/>
+        <w:tblW w:type="auto" w:w="0"/>
+        <w:tblLook w:firstColumn="1" w:firstRow="1" w:lastColumn="0" w:lastRow="0" w:noHBand="0" w:noVBand="1" w:val="04A0"/>
+      </w:tblPr>
+      <w:tblGrid>
+        <w:gridCol w:w="4320"/>
+        <w:gridCol w:w="4320"/>
+      </w:tblGrid>
+      <w:tr>
+        <w:tc>
+          <w:tcPr>
+            <w:tcW w:type="dxa" w:w="4320"/>
+          </w:tcPr>
+          <w:p>
+            <w:r>
+              <w:t>Question</w:t>
+            </w:r>
+          </w:p>
+        </w:tc>
+        <w:tc>
+          <w:tcPr>
+            <w:tcW w:type="dxa" w:w="4320"/>
+          </w:tcPr>
+          <w:p>
+            <w:r>
+              <w:t>Answer</w:t>
+            </w:r>
+          </w:p>
+        </w:tc>
+      </w:tr>
+      <w:tr>
+        <w:tc>
+          <w:tcPr>
+            <w:tcW w:type="dxa" w:w="4320"/>
+          </w:tcPr>
+          <w:p>
+            <w:r>
+              <w:t>internal/store/store.go</w:t>
+            </w:r>
+          </w:p>
+        </w:tc>
+        <w:tc>
+          <w:tcPr>
+            <w:tcW w:type="dxa" w:w="4320"/>
+          </w:tcPr>
+          <w:p>
+            <w:r>
+              <w:t>Thread-safe in-memory map. WriteLocal assigns monotonically increasing versions; PutVersion applies replicated updates only if the incoming version is new enough.</w:t>
+            </w:r>
+          </w:p>
+        </w:tc>
+      </w:tr>
+      <w:tr>
+        <w:tc>
+          <w:tcPr>
+            <w:tcW w:type="dxa" w:w="4320"/>
+          </w:tcPr>
+          <w:p>
+            <w:r>
+              <w:t>internal/kvsrv/peer_client.go</w:t>
+            </w:r>
+          </w:p>
+        </w:tc>
+        <w:tc>
+          <w:tcPr>
+            <w:tcW w:type="dxa" w:w="4320"/>
+          </w:tcPr>
+          <w:p>
+            <w:r>
+              <w:t>Wraps internal HTTP RPCs for replicate, peer-read, and cluster-read. Non-200 responses are turned into Go errors so the coordinator can decide whether to fail fast or log asynchronously.</w:t>
+            </w:r>
+          </w:p>
+        </w:tc>
+      </w:tr>
+      <w:tr>
+        <w:tc>
+          <w:tcPr>
+            <w:tcW w:type="dxa" w:w="4320"/>
+          </w:tcPr>
+          <w:p>
+            <w:r>
+              <w:t>internal/kvsrv/lf.go</w:t>
+            </w:r>
+          </w:p>
+        </w:tc>
+        <w:tc>
+          <w:tcPr>
+            <w:tcW w:type="dxa" w:w="4320"/>
+          </w:tcPr>
+          <w:p>
+            <w:r>
+              <w:t>Implements leader–follower routing, quorum-specific read/write behavior, async replication for W=1 and part of W=3, and leader-side cluster reads.</w:t>
+            </w:r>
+          </w:p>
+        </w:tc>
+      </w:tr>
+      <w:tr>
+        <w:tc>
+          <w:tcPr>
+            <w:tcW w:type="dxa" w:w="4320"/>
+          </w:tcPr>
+          <w:p>
+            <w:r>
+              <w:t>internal/kvsrv/leaderless.go</w:t>
+            </w:r>
+          </w:p>
+        </w:tc>
+        <w:tc>
+          <w:tcPr>
+            <w:tcW w:type="dxa" w:w="4320"/>
+          </w:tcPr>
+          <w:p>
+            <w:r>
+              <w:t>Implements symmetric W=N write coordination and R=1 local reads, which intentionally allows temporary staleness during propagation.</w:t>
+            </w:r>
+          </w:p>
+        </w:tc>
+      </w:tr>
+      <w:tr>
+        <w:tc>
+          <w:tcPr>
+            <w:tcW w:type="dxa" w:w="4320"/>
+          </w:tcPr>
+          <w:p>
+            <w:r>
+              <w:t>cmd/loadtest/main.go</w:t>
+            </w:r>
+          </w:p>
+        </w:tc>
+        <w:tc>
+          <w:tcPr>
+            <w:tcW w:type="dxa" w:w="4320"/>
+          </w:tcPr>
+          <w:p>
+            <w:r>
+              <w:t>Generates read/write mixes, tracks latency, records stale reads by comparing returned versions against the client's last observed write version for the same key, and saves samples to JSON.</w:t>
+            </w:r>
+          </w:p>
+        </w:tc>
+      </w:tr>
+      <w:tr>
+        <w:tc>
+          <w:tcPr>
+            <w:tcW w:type="dxa" w:w="4320"/>
+          </w:tcPr>
+          <w:p>
+            <w:r>
+              <w:t>internal/kvsrv/cluster_test.go</w:t>
+            </w:r>
+          </w:p>
+        </w:tc>
+        <w:tc>
+          <w:tcPr>
+            <w:tcW w:type="dxa" w:w="4320"/>
+          </w:tcPr>
+          <w:p>
+            <w:r>
+              <w:t>Starts in-process five-node clusters and checks the main behavioral claims: rejection of follower writes, eventual propagation, local lag windows, and successful quorum reads.</w:t>
+            </w:r>
+          </w:p>
+        </w:tc>
+      </w:tr>
+    </w:tbl>
+    <w:p>
+      <w:pPr>
+        <w:pStyle w:val="Heading3"/>
+      </w:pPr>
+      <w:r>
+        <w:t>2.2 Leader–follower: what happens on a write</w:t>
+      </w:r>
+    </w:p>
+    <w:p>
+      <w:pPr>
+        <w:pStyle w:val="ListNumber"/>
+      </w:pPr>
+      <w:r>
+        <w:t>A client sends POST /kv/set. If the request lands on a follower, the server immediately returns 403 because only the leader is allowed to coordinate writes.</w:t>
+      </w:r>
+    </w:p>
+    <w:p>
+      <w:pPr>
+        <w:pStyle w:val="ListNumber"/>
+      </w:pPr>
+      <w:r>
+        <w:t>The leader validates the JSON payload and rejects an empty key with 400.</w:t>
+      </w:r>
+    </w:p>
+    <w:p>
+      <w:pPr>
+        <w:pStyle w:val="ListNumber"/>
+      </w:pPr>
+      <w:r>
+        <w:t>The leader calls WriteLocal, which stores the new value locally and increments the per-key version.</w:t>
+      </w:r>
+    </w:p>
+    <w:p>
+      <w:pPr>
+        <w:pStyle w:val="ListNumber"/>
+      </w:pPr>
+      <w:r>
+        <w:t>The leader then applies the selected quorum profile.</w:t>
+      </w:r>
+    </w:p>
+    <w:p>
+      <w:pPr>
+        <w:pStyle w:val="ListBullet"/>
+      </w:pPr>
+      <w:r>
+        <w:t>w5r1: the leader synchronously replicates to all four followers. If any follower replication fails, the write returns 500. This gives the strongest write visibility but the highest write latency.</w:t>
+      </w:r>
+    </w:p>
+    <w:p>
+      <w:pPr>
+        <w:pStyle w:val="ListBullet"/>
+      </w:pPr>
+      <w:r>
+        <w:t>w1r5: the leader returns 201 as soon as the leader's local commit succeeds. Replication to followers continues in a background goroutine. Failures in that async tail are logged instead of being sent back to the already-completed client request.</w:t>
+      </w:r>
+    </w:p>
+    <w:p>
+      <w:pPr>
+        <w:pStyle w:val="ListBullet"/>
+      </w:pPr>
+      <w:r>
+        <w:t>r3w3: the leader blocks until two followers acknowledge, which means three replicas in total (leader plus two followers) have the write. The remaining followers are updated asynchronously.</w:t>
+      </w:r>
+    </w:p>
+    <w:p>
+      <w:r>
+        <w:t>The tricky part here is that success means different things for different profiles. In w5r1, success means every replica has acknowledged. In w1r5, success only means the leader committed locally, so a fresh read from a follower's local state can still be stale until background replication catches up.</w:t>
+      </w:r>
+    </w:p>
+    <w:p>
+      <w:pPr>
+        <w:pStyle w:val="Heading3"/>
+      </w:pPr>
+      <w:r>
+        <w:t>2.3 Leader–follower: what happens on a read</w:t>
+      </w:r>
+    </w:p>
+    <w:p>
+      <w:pPr>
+        <w:pStyle w:val="ListNumber"/>
+      </w:pPr>
+      <w:r>
+        <w:t>A client can send GET /kv/get to any leader–follower node.</w:t>
+      </w:r>
+    </w:p>
+    <w:p>
+      <w:pPr>
+        <w:pStyle w:val="ListNumber"/>
+      </w:pPr>
+      <w:r>
+        <w:t>If the request arrives at a follower, that follower forwards the read to the leader's internal cluster-read endpoint instead of answering from local state.</w:t>
+      </w:r>
+    </w:p>
+    <w:p>
+      <w:pPr>
+        <w:pStyle w:val="ListNumber"/>
+      </w:pPr>
+      <w:r>
+        <w:t>The leader executes the R rule for the active profile and returns the newest version it sees.</w:t>
+      </w:r>
+    </w:p>
+    <w:p>
+      <w:pPr>
+        <w:pStyle w:val="ListBullet"/>
+      </w:pPr>
+      <w:r>
+        <w:t>w5r1 (R=1): the leader reads only its own local store, so reads are cheap.</w:t>
+      </w:r>
+    </w:p>
+    <w:p>
+      <w:pPr>
+        <w:pStyle w:val="ListBullet"/>
+      </w:pPr>
+      <w:r>
+        <w:t>w1r5 (R=5): the leader reads all five replicas in parallel, including itself, and picks the entry with the highest version number.</w:t>
+      </w:r>
+    </w:p>
+    <w:p>
+      <w:pPr>
+        <w:pStyle w:val="ListBullet"/>
+      </w:pPr>
+      <w:r>
+        <w:t>r3w3 (R=3): the leader reads three replicas and still resolves conflicts by highest version.</w:t>
+      </w:r>
+    </w:p>
+    <w:p>
+      <w:r>
+        <w:t>The subtle point is that the merge rule is version-based, not 'first response wins'. That is why the versioned store matters: even if some replicas lag, the read path can prefer the newest visible copy.</w:t>
+      </w:r>
+    </w:p>
+    <w:p>
+      <w:pPr>
+        <w:pStyle w:val="Heading3"/>
+      </w:pPr>
+      <w:r>
+        <w:t>2.4 Leaderless: what happens on a write and read</w:t>
+      </w:r>
+    </w:p>
+    <w:p>
+      <w:pPr>
+        <w:pStyle w:val="ListNumber"/>
+      </w:pPr>
+      <w:r>
+        <w:t>Any node can receive POST /kv/set and becomes the coordinator for that request.</w:t>
+      </w:r>
+    </w:p>
+    <w:p>
+      <w:pPr>
+        <w:pStyle w:val="ListNumber"/>
+      </w:pPr>
+      <w:r>
+        <w:t>That node writes locally first, which creates the next version for the key on the coordinator.</w:t>
+      </w:r>
+    </w:p>
+    <w:p>
+      <w:pPr>
+        <w:pStyle w:val="ListNumber"/>
+      </w:pPr>
+      <w:r>
+        <w:t>It then replicates sequentially to every other replica. Because this mode is W=N, any replication failure returns 500 to the client.</w:t>
+      </w:r>
+    </w:p>
+    <w:p>
+      <w:pPr>
+        <w:pStyle w:val="ListNumber"/>
+      </w:pPr>
+      <w:r>
+        <w:t>GET /kv/get does not do quorum reads in leaderless mode. It simply returns the local node's current value, which is why stale reads are possible during the replication window.</w:t>
+      </w:r>
+    </w:p>
+    <w:p>
+      <w:r>
+        <w:t>Leaderless is therefore simple and symmetric, but it trades consistency for availability and low local read cost. The load tests show exactly that: good local responsiveness, but stale reads can appear because replicas do not reconcile on the read path.</w:t>
+      </w:r>
+    </w:p>
+    <w:p>
+      <w:pPr>
+        <w:pStyle w:val="Heading3"/>
+      </w:pPr>
+      <w:r>
+        <w:t>2.5 Error handling and tricky implementation details</w:t>
+      </w:r>
+    </w:p>
+    <w:p>
+      <w:pPr>
+        <w:pStyle w:val="ListBullet"/>
+      </w:pPr>
+      <w:r>
+        <w:t>Bad JSON and empty keys produce 400s early so malformed requests do not enter replication logic.</w:t>
+      </w:r>
+    </w:p>
+    <w:p>
+      <w:pPr>
+        <w:pStyle w:val="ListBullet"/>
+      </w:pPr>
+      <w:r>
+        <w:t>Writes sent to a follower in leader–follower mode return 403 immediately.</w:t>
+      </w:r>
+    </w:p>
+    <w:p>
+      <w:pPr>
+        <w:pStyle w:val="ListBullet"/>
+      </w:pPr>
+      <w:r>
+        <w:t>PeerClient treats non-success HTTP responses as errors, which keeps quorum code simple: synchronous paths fail the request, asynchronous paths log the error.</w:t>
+      </w:r>
+    </w:p>
+    <w:p>
+      <w:pPr>
+        <w:pStyle w:val="ListBullet"/>
+      </w:pPr>
+      <w:r>
+        <w:t>Artificial delays are inside the server logic, not the load tester, so they affect real coordination paths and not just the client view.</w:t>
+      </w:r>
+    </w:p>
+    <w:p>
+      <w:pPr>
+        <w:pStyle w:val="ListBullet"/>
+      </w:pPr>
+      <w:r>
+        <w:t>Async replication goroutines are tracked with a WaitGroup so tests and clean shutdowns do not leave background work dangling.</w:t>
+      </w:r>
+    </w:p>
+    <w:p>
+      <w:pPr>
+        <w:pStyle w:val="ListBullet"/>
+      </w:pPr>
+      <w:r>
+        <w:t>The store applies replicated writes by version order. That avoids overwriting newer data with an older replicated message if messages arrive late.</w:t>
+      </w:r>
+    </w:p>
+    <w:p>
+      <w:pPr>
+        <w:pStyle w:val="Heading3"/>
+      </w:pPr>
+      <w:r>
+        <w:t>2.6 Showing understanding of the AI-assisted code</w:t>
+      </w:r>
+    </w:p>
+    <w:p>
+      <w:r>
+        <w:t>The important invariants are small enough to explain without reading the code line-by-line: peer 0 is the only write leader in leader–follower mode; local writes create monotonically increasing versions; replicated writes are version-checked; w5r1 is synchronous on every follower, w1r5 acknowledges early and replicates later, r3w3 waits for a middle quorum; leaderless uses W=N and R=1; and the load tester marks a read stale when its returned version is behind the client's last known write version for the same key. These are the design rules every teammate should be able to explain before submission.</w:t>
+      </w:r>
+    </w:p>
+    <w:p>
+      <w:pPr>
+        <w:pStyle w:val="Heading2"/>
+      </w:pPr>
+      <w:r>
+        <w:t>3. Test strategy</w:t>
+      </w:r>
+    </w:p>
+    <w:p>
+      <w:pPr>
+        <w:pStyle w:val="ListBullet"/>
+      </w:pPr>
+      <w:r>
+        <w:t>The tests build real in-process five-node clusters instead of mocking quorum behavior.</w:t>
+      </w:r>
+    </w:p>
+    <w:p>
+      <w:pPr>
+        <w:pStyle w:val="ListBullet"/>
+      </w:pPr>
+      <w:r>
+        <w:t>TestLeaderFollower_W5R1_ConsistentAfterWrite checks that a leader write is visible through /kv/get after synchronous replication completes.</w:t>
+      </w:r>
+    </w:p>
+    <w:p>
+      <w:pPr>
+        <w:pStyle w:val="ListBullet"/>
+      </w:pPr>
+      <w:r>
+        <w:t>TestLeaderFollower_LocalReadDuringReplication intentionally probes /kv/local_read under w1r5 to show that follower-local state can lag while async replication is still running.</w:t>
+      </w:r>
+    </w:p>
+    <w:p>
+      <w:pPr>
+        <w:pStyle w:val="ListBullet"/>
+      </w:pPr>
+      <w:r>
+        <w:t>TestLeaderless_EventualConsistencyWindow checks that non-coordinator replicas can miss a key during replication and then converge after the write finishes.</w:t>
+      </w:r>
+    </w:p>
+    <w:p>
+      <w:pPr>
+        <w:pStyle w:val="ListBullet"/>
+      </w:pPr>
+      <w:r>
+        <w:t>Additional tests cover rejection of follower writes, empty keys, and the r3w3 read/write path.</w:t>
+      </w:r>
+    </w:p>
+    <w:p>
+      <w:r>
+        <w:t>Recommended command: go test ./... -race -timeout 120s</w:t>
+      </w:r>
+    </w:p>
+    <w:p>
+      <w:pPr>
+        <w:pStyle w:val="Heading2"/>
+      </w:pPr>
+      <w:r>
+        <w:t>4. Experimental setup</w:t>
       </w:r>
     </w:p>
     <w:p>
@@ -65,7 +591,302 @@
         <w:pStyle w:val="Heading2"/>
       </w:pPr>
       <w:r>
-        <w:t>Analysis (edit as needed)</w:t>
+        <w:t>5. Results and discussion</w:t>
+      </w:r>
+    </w:p>
+    <w:p>
+      <w:pPr>
+        <w:pStyle w:val="Heading3"/>
+      </w:pPr>
+      <w:r>
+        <w:t>5.1 Which leader–follower profile wins at each write ratio?</w:t>
+      </w:r>
+    </w:p>
+    <w:tbl>
+      <w:tblPr>
+        <w:tblStyle w:val="TableGrid"/>
+        <w:tblW w:type="auto" w:w="0"/>
+        <w:tblLook w:firstColumn="1" w:firstRow="1" w:lastColumn="0" w:lastRow="0" w:noHBand="0" w:noVBand="1" w:val="04A0"/>
+      </w:tblPr>
+      <w:tblGrid>
+        <w:gridCol w:w="1728"/>
+        <w:gridCol w:w="1728"/>
+        <w:gridCol w:w="1728"/>
+        <w:gridCol w:w="1728"/>
+        <w:gridCol w:w="1728"/>
+      </w:tblGrid>
+      <w:tr>
+        <w:tc>
+          <w:tcPr>
+            <w:tcW w:type="dxa" w:w="1728"/>
+          </w:tcPr>
+          <w:p>
+            <w:r>
+              <w:t>Write ratio</w:t>
+            </w:r>
+          </w:p>
+        </w:tc>
+        <w:tc>
+          <w:tcPr>
+            <w:tcW w:type="dxa" w:w="1728"/>
+          </w:tcPr>
+          <w:p>
+            <w:r>
+              <w:t>w5r1 ops</w:t>
+            </w:r>
+          </w:p>
+        </w:tc>
+        <w:tc>
+          <w:tcPr>
+            <w:tcW w:type="dxa" w:w="1728"/>
+          </w:tcPr>
+          <w:p>
+            <w:r>
+              <w:t>w1r5 ops</w:t>
+            </w:r>
+          </w:p>
+        </w:tc>
+        <w:tc>
+          <w:tcPr>
+            <w:tcW w:type="dxa" w:w="1728"/>
+          </w:tcPr>
+          <w:p>
+            <w:r>
+              <w:t>r3w3 ops</w:t>
+            </w:r>
+          </w:p>
+        </w:tc>
+        <w:tc>
+          <w:tcPr>
+            <w:tcW w:type="dxa" w:w="1728"/>
+          </w:tcPr>
+          <w:p>
+            <w:r>
+              <w:t>Winner</w:t>
+            </w:r>
+          </w:p>
+        </w:tc>
+      </w:tr>
+      <w:tr>
+        <w:tc>
+          <w:tcPr>
+            <w:tcW w:type="dxa" w:w="1728"/>
+          </w:tcPr>
+          <w:p>
+            <w:r>
+              <w:t>1%</w:t>
+            </w:r>
+          </w:p>
+        </w:tc>
+        <w:tc>
+          <w:tcPr>
+            <w:tcW w:type="dxa" w:w="1728"/>
+          </w:tcPr>
+          <w:p>
+            <w:r>
+              <w:t>1421</w:t>
+            </w:r>
+          </w:p>
+        </w:tc>
+        <w:tc>
+          <w:tcPr>
+            <w:tcW w:type="dxa" w:w="1728"/>
+          </w:tcPr>
+          <w:p>
+            <w:r>
+              <w:t>843</w:t>
+            </w:r>
+          </w:p>
+        </w:tc>
+        <w:tc>
+          <w:tcPr>
+            <w:tcW w:type="dxa" w:w="1728"/>
+          </w:tcPr>
+          <w:p>
+            <w:r>
+              <w:t>1273</w:t>
+            </w:r>
+          </w:p>
+        </w:tc>
+        <w:tc>
+          <w:tcPr>
+            <w:tcW w:type="dxa" w:w="1728"/>
+          </w:tcPr>
+          <w:p>
+            <w:r>
+              <w:t>w5r1</w:t>
+            </w:r>
+          </w:p>
+        </w:tc>
+      </w:tr>
+      <w:tr>
+        <w:tc>
+          <w:tcPr>
+            <w:tcW w:type="dxa" w:w="1728"/>
+          </w:tcPr>
+          <w:p>
+            <w:r>
+              <w:t>10%</w:t>
+            </w:r>
+          </w:p>
+        </w:tc>
+        <w:tc>
+          <w:tcPr>
+            <w:tcW w:type="dxa" w:w="1728"/>
+          </w:tcPr>
+          <w:p>
+            <w:r>
+              <w:t>1221</w:t>
+            </w:r>
+          </w:p>
+        </w:tc>
+        <w:tc>
+          <w:tcPr>
+            <w:tcW w:type="dxa" w:w="1728"/>
+          </w:tcPr>
+          <w:p>
+            <w:r>
+              <w:t>1538</w:t>
+            </w:r>
+          </w:p>
+        </w:tc>
+        <w:tc>
+          <w:tcPr>
+            <w:tcW w:type="dxa" w:w="1728"/>
+          </w:tcPr>
+          <w:p>
+            <w:r>
+              <w:t>1259</w:t>
+            </w:r>
+          </w:p>
+        </w:tc>
+        <w:tc>
+          <w:tcPr>
+            <w:tcW w:type="dxa" w:w="1728"/>
+          </w:tcPr>
+          <w:p>
+            <w:r>
+              <w:t>w1r5</w:t>
+            </w:r>
+          </w:p>
+        </w:tc>
+      </w:tr>
+      <w:tr>
+        <w:tc>
+          <w:tcPr>
+            <w:tcW w:type="dxa" w:w="1728"/>
+          </w:tcPr>
+          <w:p>
+            <w:r>
+              <w:t>50%</w:t>
+            </w:r>
+          </w:p>
+        </w:tc>
+        <w:tc>
+          <w:tcPr>
+            <w:tcW w:type="dxa" w:w="1728"/>
+          </w:tcPr>
+          <w:p>
+            <w:r>
+              <w:t>536</w:t>
+            </w:r>
+          </w:p>
+        </w:tc>
+        <w:tc>
+          <w:tcPr>
+            <w:tcW w:type="dxa" w:w="1728"/>
+          </w:tcPr>
+          <w:p>
+            <w:r>
+              <w:t>1825</w:t>
+            </w:r>
+          </w:p>
+        </w:tc>
+        <w:tc>
+          <w:tcPr>
+            <w:tcW w:type="dxa" w:w="1728"/>
+          </w:tcPr>
+          <w:p>
+            <w:r>
+              <w:t>797</w:t>
+            </w:r>
+          </w:p>
+        </w:tc>
+        <w:tc>
+          <w:tcPr>
+            <w:tcW w:type="dxa" w:w="1728"/>
+          </w:tcPr>
+          <w:p>
+            <w:r>
+              <w:t>w1r5</w:t>
+            </w:r>
+          </w:p>
+        </w:tc>
+      </w:tr>
+      <w:tr>
+        <w:tc>
+          <w:tcPr>
+            <w:tcW w:type="dxa" w:w="1728"/>
+          </w:tcPr>
+          <w:p>
+            <w:r>
+              <w:t>90%</w:t>
+            </w:r>
+          </w:p>
+        </w:tc>
+        <w:tc>
+          <w:tcPr>
+            <w:tcW w:type="dxa" w:w="1728"/>
+          </w:tcPr>
+          <w:p>
+            <w:r>
+              <w:t>319</w:t>
+            </w:r>
+          </w:p>
+        </w:tc>
+        <w:tc>
+          <w:tcPr>
+            <w:tcW w:type="dxa" w:w="1728"/>
+          </w:tcPr>
+          <w:p>
+            <w:r>
+              <w:t>2160</w:t>
+            </w:r>
+          </w:p>
+        </w:tc>
+        <w:tc>
+          <w:tcPr>
+            <w:tcW w:type="dxa" w:w="1728"/>
+          </w:tcPr>
+          <w:p>
+            <w:r>
+              <w:t>549</w:t>
+            </w:r>
+          </w:p>
+        </w:tc>
+        <w:tc>
+          <w:tcPr>
+            <w:tcW w:type="dxa" w:w="1728"/>
+          </w:tcPr>
+          <w:p>
+            <w:r>
+              <w:t>w1r5</w:t>
+            </w:r>
+          </w:p>
+        </w:tc>
+      </w:tr>
+    </w:tbl>
+    <w:p>
+      <w:r>
+        <w:t>This table answers the rubric's direct question: in this AWS run, w5r1 is best only when writes are extremely rare (1%), while w1r5 wins once writes become common enough that synchronous W=5 dominates the total cost of completed operations.</w:t>
+      </w:r>
+    </w:p>
+    <w:p>
+      <w:pPr>
+        <w:pStyle w:val="Heading3"/>
+      </w:pPr>
+      <w:r>
+        <w:t>5.2 Mechanism-based analysis</w:t>
       </w:r>
     </w:p>
     <w:p>
@@ -102,7 +923,7 @@
         <w:pStyle w:val="ListBullet"/>
       </w:pPr>
       <w:r>
-        <w:t>**1% writes:** **w5r1** (1421) &gt; **r3w3** (1273) &gt; **w1r5** (843). Reads dominate; **R=1** (leader-local) avoids read fan-out, so **w5r1** leads. **w1r5** pays **R=5** on every `cluster-read`, so it is slowest.</w:t>
+        <w:t>1% writes: w5r1 (1421) &gt; r3w3 (1273) &gt; w1r5 (843). Reads dominate; R=1 (leader-local) avoids read fan-out, so w5r1 leads. w1r5 pays R=5 on every cluster-read, so it is slowest.</w:t>
       </w:r>
     </w:p>
     <w:p>
@@ -110,7 +931,7 @@
         <w:pStyle w:val="ListBullet"/>
       </w:pPr>
       <w:r>
-        <w:t>**10% writes:** **w1r5** (1538) &gt; **r3w3** (1259) &gt; **w5r1** (1221). Even with mostly reads, **w1r5** wins on *count of completed ops* here: cheap leader commits on the minority writes avoid the long **W=5** write path that **w5r1** pays whenever a write happens; the mix shifts total work enough that leader latency dominates. (Intuition: r3w3 stays in the middle; w5r1 pays full replica sync on each write.)</w:t>
+        <w:t>10% writes: w1r5 (1538) &gt; r3w3 (1259) &gt; w5r1 (1221). Even with mostly reads, w1r5 wins on *count of completed ops* here: cheap leader commits on the minority writes avoid the long W=5 write path that w5r1 pays whenever a write happens; the mix shifts total work enough that leader latency dominates. (Intuition: r3w3 stays in the middle; w5r1 pays full replica sync on each write.)</w:t>
       </w:r>
     </w:p>
     <w:p>
@@ -118,7 +939,7 @@
         <w:pStyle w:val="ListBullet"/>
       </w:pPr>
       <w:r>
-        <w:t>**50% writes:** **w1r5** (1825) &gt;&gt; **r3w3** (797) &gt; **w5r1** (536). **Cheap write ack (W=1)** dominates when half the ops are writes.</w:t>
+        <w:t>50% writes: w1r5 (1825) &gt;&gt; r3w3 (797) &gt; w5r1 (536). Cheap write ack (W=1) dominates when half the ops are writes.</w:t>
       </w:r>
     </w:p>
     <w:p>
@@ -126,7 +947,7 @@
         <w:pStyle w:val="ListBullet"/>
       </w:pPr>
       <w:r>
-        <w:t>**90% writes:** **w1r5** (2160) &gt;&gt; **r3w3** (549) &gt; **w5r1** (319). **w5r1** collapses because every write waits for all followers synchronously.</w:t>
+        <w:t>90% writes: w1r5 (2160) &gt;&gt; r3w3 (549) &gt; w5r1 (319). w5r1 collapses because every write waits for all followers synchronously.</w:t>
       </w:r>
     </w:p>
     <w:p>
@@ -142,7 +963,7 @@
         <w:pStyle w:val="ListBullet"/>
       </w:pPr>
       <w:r>
-        <w:t>**w5r1** minimizes **read path cost** (R=1) but maximizes **write path cost** (W=5) — best when writes are **rare**.</w:t>
+        <w:t>w5r1 minimizes read path cost (R=1) but maximizes write path cost (W=5) — best when writes are rare.</w:t>
       </w:r>
     </w:p>
     <w:p>
@@ -150,7 +971,7 @@
         <w:pStyle w:val="ListBullet"/>
       </w:pPr>
       <w:r>
-        <w:t>**w1r5** minimizes **leader write return time** (W=1) but pays **R=5** read fan-out — still wins at **high write fractions** in this experiment because synchronous **W=5** on w5r1 is the dominant bottleneck once writes are common.</w:t>
+        <w:t>w1r5 minimizes leader write return time (W=1) but pays R=5 read fan-out — still wins at high write fractions in this experiment because synchronous W=5 on w5r1 is the dominant bottleneck once writes are common.</w:t>
       </w:r>
     </w:p>
     <w:p>
@@ -158,7 +979,7 @@
         <w:pStyle w:val="ListBullet"/>
       </w:pPr>
       <w:r>
-        <w:t>**r3w3** balances **W=3** and **R=3** — typically **middle** throughput; good when you want a compromise between the two extremes.</w:t>
+        <w:t>r3w3 balances W=3 and R=3 — typically middle throughput; good when you want a compromise between the two extremes.</w:t>
       </w:r>
     </w:p>
     <w:p>
@@ -230,7 +1051,7 @@
         <w:pStyle w:val="ListBullet"/>
       </w:pPr>
       <w:r>
-        <w:t>**w5r1 (strong writes, cheap reads):** Workloads with **infrequent writes** and a need for **linearizable-or-strong reads** without fan-out — e.g. rarely-updated reference data, configuration, or “read-mostly” catalogs where write latency is acceptable.</w:t>
+        <w:t>w5r1 (strong writes, cheap reads): Workloads with infrequent writes and a need for linearizable-or-strong reads without fan-out — e.g. rarely-updated reference data, configuration, or “read-mostly” catalogs where write latency is acceptable.</w:t>
       </w:r>
     </w:p>
     <w:p>
@@ -238,7 +1059,7 @@
         <w:pStyle w:val="ListBullet"/>
       </w:pPr>
       <w:r>
-        <w:t>**w1r5 (cheap writes, expensive quorum reads):** **Write-heavy** or ingest pipelines where **low write latency** matters and you can pay for **read reconciliation** (analytics, logging metadata, dashboards that can tolerate slower reads or run off-peak).</w:t>
+        <w:t>w1r5 (cheap writes, expensive quorum reads): Write-heavy or ingest pipelines where low write latency matters and you can pay for read reconciliation (analytics, logging metadata, dashboards that can tolerate slower reads or run off-peak).</w:t>
       </w:r>
     </w:p>
     <w:p>
@@ -246,7 +1067,7 @@
         <w:pStyle w:val="ListBullet"/>
       </w:pPr>
       <w:r>
-        <w:t>**r3w3:** **Balanced** OLTP-style mixes where you want **better availability / latency tradeoffs** than all-replica writes but **stronger** reads than a single node — typical “middle quorum” for general services.</w:t>
+        <w:t>r3w3: Balanced OLTP-style mixes where you want better availability / latency tradeoffs than all-replica writes but stronger reads than a single node — typical “middle quorum” for general services.</w:t>
       </w:r>
     </w:p>
     <w:p>
@@ -254,7 +1075,7 @@
         <w:pStyle w:val="ListBullet"/>
       </w:pPr>
       <w:r>
-        <w:t>**Leaderless W=N, R=1:** **Low read latency**, **partition-tolerant scale-out** memcached/dynamo-flavored use cases where **eventual consistency** and occasional **stale reads** are acceptable (feature flags, social counters, session caches). **Not** for balances or inventory without application-level versioning.</w:t>
+        <w:t>Leaderless W=N, R=1: Low read latency, partition-tolerant scale-out memcached/dynamo-flavored use cases where eventual consistency and occasional stale reads are acceptable (feature flags, social counters, session caches). Not for balances or inventory without application-level versioning.</w:t>
       </w:r>
     </w:p>
     <w:p>
@@ -278,12 +1099,20 @@
         <w:pStyle w:val="Heading2"/>
       </w:pPr>
       <w:r>
-        <w:t>Histograms (AWS, 50s × 8 workers)</w:t>
+        <w:t>6. Figures</w:t>
       </w:r>
     </w:p>
     <w:p>
       <w:r>
-        <w:t>Generated by scripts/plot_loadtest.py via scripts/plot_results_dir.sh. Each file: read latency, write latency, time since last write to same key.</w:t>
+        <w:t>The following figures cover read latency, write latency, and time since the last write to the same key for all write ratios in the AWS sweep.</w:t>
+      </w:r>
+    </w:p>
+    <w:p>
+      <w:pPr>
+        <w:pStyle w:val="Heading3"/>
+      </w:pPr>
+      <w:r>
+        <w:t>lf-r3w3-w0.01</w:t>
       </w:r>
     </w:p>
     <w:p>
@@ -420,6 +1249,14 @@
     </w:p>
     <w:p>
       <w:pPr>
+        <w:pStyle w:val="Heading3"/>
+      </w:pPr>
+      <w:r>
+        <w:t>lf-r3w3-w0.1</w:t>
+      </w:r>
+    </w:p>
+    <w:p>
+      <w:pPr>
         <w:pStyle w:val="IntenseQuote"/>
       </w:pPr>
       <w:r>
@@ -552,6 +1389,14 @@
     </w:p>
     <w:p>
       <w:pPr>
+        <w:pStyle w:val="Heading3"/>
+      </w:pPr>
+      <w:r>
+        <w:t>lf-r3w3-w0.5</w:t>
+      </w:r>
+    </w:p>
+    <w:p>
+      <w:pPr>
         <w:pStyle w:val="IntenseQuote"/>
       </w:pPr>
       <w:r>
@@ -684,6 +1529,14 @@
     </w:p>
     <w:p>
       <w:pPr>
+        <w:pStyle w:val="Heading3"/>
+      </w:pPr>
+      <w:r>
+        <w:t>lf-r3w3-w0.9</w:t>
+      </w:r>
+    </w:p>
+    <w:p>
+      <w:pPr>
         <w:pStyle w:val="IntenseQuote"/>
       </w:pPr>
       <w:r>
@@ -816,6 +1669,14 @@
     </w:p>
     <w:p>
       <w:pPr>
+        <w:pStyle w:val="Heading3"/>
+      </w:pPr>
+      <w:r>
+        <w:t>lf-w1r5-w0.01</w:t>
+      </w:r>
+    </w:p>
+    <w:p>
+      <w:pPr>
         <w:pStyle w:val="IntenseQuote"/>
       </w:pPr>
       <w:r>
@@ -948,6 +1809,14 @@
     </w:p>
     <w:p>
       <w:pPr>
+        <w:pStyle w:val="Heading3"/>
+      </w:pPr>
+      <w:r>
+        <w:t>lf-w1r5-w0.1</w:t>
+      </w:r>
+    </w:p>
+    <w:p>
+      <w:pPr>
         <w:pStyle w:val="IntenseQuote"/>
       </w:pPr>
       <w:r>
@@ -1080,6 +1949,14 @@
     </w:p>
     <w:p>
       <w:pPr>
+        <w:pStyle w:val="Heading3"/>
+      </w:pPr>
+      <w:r>
+        <w:t>lf-w1r5-w0.5</w:t>
+      </w:r>
+    </w:p>
+    <w:p>
+      <w:pPr>
         <w:pStyle w:val="IntenseQuote"/>
       </w:pPr>
       <w:r>
@@ -1212,6 +2089,14 @@
     </w:p>
     <w:p>
       <w:pPr>
+        <w:pStyle w:val="Heading3"/>
+      </w:pPr>
+      <w:r>
+        <w:t>lf-w1r5-w0.9</w:t>
+      </w:r>
+    </w:p>
+    <w:p>
+      <w:pPr>
         <w:pStyle w:val="IntenseQuote"/>
       </w:pPr>
       <w:r>
@@ -1344,6 +2229,14 @@
     </w:p>
     <w:p>
       <w:pPr>
+        <w:pStyle w:val="Heading3"/>
+      </w:pPr>
+      <w:r>
+        <w:t>lf-w5r1-w0.01</w:t>
+      </w:r>
+    </w:p>
+    <w:p>
+      <w:pPr>
         <w:pStyle w:val="IntenseQuote"/>
       </w:pPr>
       <w:r>
@@ -1476,6 +2369,14 @@
     </w:p>
     <w:p>
       <w:pPr>
+        <w:pStyle w:val="Heading3"/>
+      </w:pPr>
+      <w:r>
+        <w:t>lf-w5r1-w0.1</w:t>
+      </w:r>
+    </w:p>
+    <w:p>
+      <w:pPr>
         <w:pStyle w:val="IntenseQuote"/>
       </w:pPr>
       <w:r>
@@ -1608,6 +2509,14 @@
     </w:p>
     <w:p>
       <w:pPr>
+        <w:pStyle w:val="Heading3"/>
+      </w:pPr>
+      <w:r>
+        <w:t>lf-w5r1-w0.5</w:t>
+      </w:r>
+    </w:p>
+    <w:p>
+      <w:pPr>
         <w:pStyle w:val="IntenseQuote"/>
       </w:pPr>
       <w:r>
@@ -1740,6 +2649,14 @@
     </w:p>
     <w:p>
       <w:pPr>
+        <w:pStyle w:val="Heading3"/>
+      </w:pPr>
+      <w:r>
+        <w:t>lf-w5r1-w0.9</w:t>
+      </w:r>
+    </w:p>
+    <w:p>
+      <w:pPr>
         <w:pStyle w:val="IntenseQuote"/>
       </w:pPr>
       <w:r>
@@ -1872,6 +2789,14 @@
     </w:p>
     <w:p>
       <w:pPr>
+        <w:pStyle w:val="Heading3"/>
+      </w:pPr>
+      <w:r>
+        <w:t>ll-w0.01</w:t>
+      </w:r>
+    </w:p>
+    <w:p>
+      <w:pPr>
         <w:pStyle w:val="IntenseQuote"/>
       </w:pPr>
       <w:r>
@@ -2004,6 +2929,14 @@
     </w:p>
     <w:p>
       <w:pPr>
+        <w:pStyle w:val="Heading3"/>
+      </w:pPr>
+      <w:r>
+        <w:t>ll-w0.1</w:t>
+      </w:r>
+    </w:p>
+    <w:p>
+      <w:pPr>
         <w:pStyle w:val="IntenseQuote"/>
       </w:pPr>
       <w:r>
@@ -2136,6 +3069,14 @@
     </w:p>
     <w:p>
       <w:pPr>
+        <w:pStyle w:val="Heading3"/>
+      </w:pPr>
+      <w:r>
+        <w:t>ll-w0.5</w:t>
+      </w:r>
+    </w:p>
+    <w:p>
+      <w:pPr>
         <w:pStyle w:val="IntenseQuote"/>
       </w:pPr>
       <w:r>
@@ -2264,6 +3205,14 @@
             </a:graphic>
           </wp:inline>
         </w:drawing>
+      </w:r>
+    </w:p>
+    <w:p>
+      <w:pPr>
+        <w:pStyle w:val="Heading3"/>
+      </w:pPr>
+      <w:r>
+        <w:t>ll-w0.9</w:t>
       </w:r>
     </w:p>
     <w:p>

</xml_diff>